<commit_message>
docs: publish final submission document pair
Replace the competition plan PDF and DOCX with the final reviewed versions.
</commit_message>
<xml_diff>
--- a/docs/plan_final.docx
+++ b/docs/plan_final.docx
@@ -700,7 +700,7 @@
             <w:sz w:val="24"/>
             <w:szCs w:val="24"/>
           </w:rPr>
-          <w:t xml:space="preserve">11</w:t>
+          <w:t xml:space="preserve">10</w:t>
         </w:r>
       </w:hyperlink>
     </w:p>
@@ -811,7 +811,7 @@
             <w:sz w:val="24"/>
             <w:szCs w:val="24"/>
           </w:rPr>
-          <w:t xml:space="preserve">12</w:t>
+          <w:t xml:space="preserve">11</w:t>
         </w:r>
       </w:hyperlink>
     </w:p>
@@ -3699,7 +3699,7 @@
           <w:b w:val="0"/>
           <w:sz w:val="24"/>
         </w:rPr>
-        <w:t>旧版赛事文件要求 2-5 人组队；2026-09-02 最新官方公告更新为允许个人或 1-5 人组队。本项目拟按最新公告以个人形式申报，并计划立即向组委会请求书面确认；在收到回执前不表述为「已确认」。吕忱耘为项目唯一负责人，承担场景定义、产品边界、规则设计、工程实现、评测复核、材料提交和路演责任。金融风控、OCR/安全工程和机构销售是已知能力缺口，计划通过正式顾问与赛事导师资源补足；顾问仅在本人同意署名后列入团队材料。</w:t>
+        <w:t>吕忱耘为项目唯一负责人，承担场景定义、产品边界、规则设计、工程实现、评测复核、材料提交和路演责任。金融风控、OCR/安全工程和机构销售是已知能力缺口，计划通过正式顾问与赛事导师资源补足；顾问仅在本人同意署名后列入团队材料。</w:t>
       </w:r>
     </w:p>
     <w:p>
@@ -5003,8 +5003,60 @@
           <w:b w:val="0"/>
           <w:sz w:val="24"/>
         </w:rPr>
-        <w:t>以下 5 条命令按序执行，即可完成从数据生成、单案运行到全量评测与回归测试的完整复现：</w:t>
+        <w:t xml:space="preserve">以下 5 条命令按序执行，即可完成从数据生成、单案运行到全量评测与回归测试的完整复现；代码仓库与冻结版本地址：</w:t>
       </w:r>
+    </w:p>
+    <w:p>
+      <w:pPr>
+        <w:spacing w:before="0" w:after="120" w:line="336" w:lineRule="auto"/>
+        <w:ind w:firstLine="480"/>
+      </w:pPr>
+      <w:r>
+        <w:rPr>
+          <w:rFonts w:ascii="Times New Roman" w:hAnsi="Times New Roman" w:eastAsia="宋体"/>
+          <w:b w:val="0"/>
+          <w:sz w:val="24"/>
+        </w:rPr>
+        <w:t xml:space="preserve">代码仓库：</w:t>
+      </w:r>
+      <w:hyperlink r:id="rId12">
+        <w:r>
+          <w:rPr>
+            <w:rFonts w:ascii="Times New Roman" w:hAnsi="Times New Roman" w:eastAsia="宋体"/>
+            <w:b w:val="0"/>
+            <w:color w:val="0563C1"/>
+            <w:u w:val="single"/>
+            <w:sz w:val="24"/>
+          </w:rPr>
+          <w:t xml:space="preserve">https://github.com/LvChenyun1022/suanlian-jindun</w:t>
+        </w:r>
+      </w:hyperlink>
+    </w:p>
+    <w:p>
+      <w:pPr>
+        <w:spacing w:before="0" w:after="120" w:line="336" w:lineRule="auto"/>
+        <w:ind w:firstLine="480"/>
+      </w:pPr>
+      <w:r>
+        <w:rPr>
+          <w:rFonts w:ascii="Times New Roman" w:hAnsi="Times New Roman" w:eastAsia="宋体"/>
+          <w:b w:val="0"/>
+          <w:sz w:val="24"/>
+        </w:rPr>
+        <w:t xml:space="preserve">冻结版本（提交版，评测数据与命令均以此为准）：</w:t>
+      </w:r>
+      <w:hyperlink r:id="rId13">
+        <w:r>
+          <w:rPr>
+            <w:rFonts w:ascii="Times New Roman" w:hAnsi="Times New Roman" w:eastAsia="宋体"/>
+            <w:b w:val="0"/>
+            <w:color w:val="0563C1"/>
+            <w:u w:val="single"/>
+            <w:sz w:val="24"/>
+          </w:rPr>
+          <w:t xml:space="preserve">https://github.com/LvChenyun1022/suanlian-jindun/releases/tag/submission-2026-09-10-final</w:t>
+        </w:r>
+      </w:hyperlink>
     </w:p>
     <w:p>
       <w:pPr>
@@ -5150,7 +5202,7 @@
     </w:p>
     <w:p>
       <w:pPr>
-        <w:spacing w:before="0" w:after="80" w:line="336" w:lineRule="auto"/>
+        <w:spacing w:before="0" w:after="60" w:line="300" w:lineRule="auto"/>
       </w:pPr>
       <w:r>
         <w:rPr>
@@ -5163,7 +5215,7 @@
     </w:p>
     <w:p>
       <w:pPr>
-        <w:spacing w:before="0" w:after="60" w:line="300" w:lineRule="auto"/>
+        <w:spacing w:before="0" w:after="40" w:line="288" w:lineRule="auto"/>
       </w:pPr>
       <w:r>
         <w:rPr>
@@ -5176,7 +5228,7 @@
     </w:p>
     <w:p>
       <w:pPr>
-        <w:spacing w:before="0" w:after="60" w:line="300" w:lineRule="auto"/>
+        <w:spacing w:before="0" w:after="40" w:line="288" w:lineRule="auto"/>
       </w:pPr>
       <w:r>
         <w:rPr>
@@ -5189,7 +5241,7 @@
     </w:p>
     <w:p>
       <w:pPr>
-        <w:spacing w:before="0" w:after="60" w:line="300" w:lineRule="auto"/>
+        <w:spacing w:before="0" w:after="40" w:line="288" w:lineRule="auto"/>
       </w:pPr>
       <w:r>
         <w:rPr>
@@ -5197,12 +5249,12 @@
           <w:b w:val="0"/>
           <w:sz w:val="18"/>
         </w:rPr>
-        <w:t>[3] 财新等公开报道：应收账款电子凭证市场数据。属媒体二手口径，使用前应复核统计定义与时点。</w:t>
+        <w:t>[3] 中国互联网金融协会：《应收账款电子凭证业务和供应链信息服务机构自律管理情况通告》，2026-02-13；财新网报道（finance.caixin.com/2026-02-13/102414536.html）：全年开立 4.00 万亿元、融资 2.84 万亿元、平均利率 2.85%。属行业自律统计与媒体二手口径，使用前应复核统计定义与时点。</w:t>
       </w:r>
     </w:p>
     <w:p>
       <w:pPr>
-        <w:spacing w:before="0" w:after="60" w:line="300" w:lineRule="auto"/>
+        <w:spacing w:before="0" w:after="40" w:line="288" w:lineRule="auto"/>
       </w:pPr>
       <w:r>
         <w:rPr>
@@ -5210,12 +5262,12 @@
           <w:b w:val="0"/>
           <w:sz w:val="18"/>
         </w:rPr>
-        <w:t>[4] 公开 GPU 租赁、数据中心 REITs 报道。仅支持场景存在性，不作为残值、折旧或回收期的估值证据。</w:t>
+        <w:t>[4] 深圳证券交易所：南方润泽科技数据中心 REIT（基金代码 180901）上市公告，2025-08-08 上市（中国证监会 2025-06 注册批复）；查询入口：szse.cn 基金信息披露栏目。GPU 租赁价格 2025 年以来明显回调，因公开报道口径不一，本文不引用具体数值。以上仅支持场景存在性与价格趋势，不作为残值、折旧或回收期的估值证据。</w:t>
       </w:r>
     </w:p>
     <w:p>
       <w:pPr>
-        <w:spacing w:before="0" w:after="60" w:line="300" w:lineRule="auto"/>
+        <w:spacing w:before="0" w:after="40" w:line="288" w:lineRule="auto"/>
       </w:pPr>
       <w:r>
         <w:rPr>
@@ -5223,12 +5275,12 @@
           <w:b w:val="0"/>
           <w:sz w:val="18"/>
         </w:rPr>
-        <w:t>[5] 经济观察报等金融智能体市场预测。属预测性二手资料，不是经审计市场规模或客户付费证明。</w:t>
+        <w:t>[5] IDC《中国 AI Agent 市场剖析及厂商推荐，3Q25》（Doc #CHC53058025），2025；idc.com/getdoc.jsp?containerId=CHC53058025：2025 年中国企业级 AI Agent 市场规模约 190 亿元，预计年复合增长率超 110%；经济观察网等媒体转载。属预测性二手资料，不是经审计市场规模或客户付费证明。</w:t>
       </w:r>
     </w:p>
     <w:p>
       <w:pPr>
-        <w:spacing w:before="0" w:after="60" w:line="300" w:lineRule="auto"/>
+        <w:spacing w:before="0" w:after="40" w:line="288" w:lineRule="auto"/>
       </w:pPr>
       <w:r>
         <w:rPr>
@@ -5236,12 +5288,12 @@
           <w:b w:val="0"/>
           <w:sz w:val="18"/>
         </w:rPr>
-        <w:t>[6] 厂商公开材料所述人工/自动审单效率。属供应商宣传口径，不视为独立基准或本项目实测。</w:t>
+        <w:t>[6] 供应链金融科技厂商公开宣传材料所述人工/自动审单效率对比。因无法获得可独立核验的原始链接与统计口径，本文仅作定性引用（人工审单以天计、自动化显著缩短处理时间），不引用具体数值，不视为独立基准或本项目实测。</w:t>
       </w:r>
     </w:p>
     <w:p>
       <w:pPr>
-        <w:spacing w:before="0" w:after="60" w:line="300" w:lineRule="auto"/>
+        <w:spacing w:before="0" w:after="40" w:line="288" w:lineRule="auto"/>
       </w:pPr>
       <w:r>
         <w:rPr>
@@ -5249,12 +5301,12 @@
           <w:b w:val="0"/>
           <w:sz w:val="18"/>
         </w:rPr>
-        <w:t>[7] 北京市国资委公开信息：北京人工智能公共算力平台及相关算电协同场景；gzw.beijing.gov.cn。</w:t>
+        <w:t>[7] 北京市人民政府国有资产监督管理委员会网站公开报道：北京人工智能公共算力平台上线及算电协同相关场景，2026-06-17；gzw.beijing.gov.cn/xxfb/gzyw/bjsgzdt/202606/t20260617_4703507.html。</w:t>
       </w:r>
     </w:p>
     <w:p>
       <w:pPr>
-        <w:spacing w:before="0" w:after="60" w:line="300" w:lineRule="auto"/>
+        <w:spacing w:before="0" w:after="40" w:line="288" w:lineRule="auto"/>
       </w:pPr>
       <w:r>
         <w:rPr>
@@ -5262,12 +5314,12 @@
           <w:b w:val="0"/>
           <w:sz w:val="18"/>
         </w:rPr>
-        <w:t>[8] 北京大学创业训练营：《北大重磅招募｜北京大学金融 AI 智能体创新大赛全球报名开启！》，2026-09-02 发布，2026-09-06 访问；mp.weixin.qq.com/s/mjNO8vBkY1UGsyS4Sjk5ug。旧版赛事文件记载 2-5 人组队，最新公告允许个人或 1-5 人组队；个人资格以组委会书面回执为准。</w:t>
+        <w:t>[8] 北京大学创业训练营：《北大重磅招募｜北京大学金融 AI 智能体创新大赛全球报名开启！》，2026-09-02 发布，2026-09-06 访问；mp.weixin.qq.com/s/mjNO8vBkY1UGsyS4Sjk5ug。</w:t>
       </w:r>
     </w:p>
     <w:p>
       <w:pPr>
-        <w:spacing w:before="0" w:after="60" w:line="300" w:lineRule="auto"/>
+        <w:spacing w:before="0" w:after="40" w:line="288" w:lineRule="auto"/>
       </w:pPr>
       <w:r>
         <w:rPr>
@@ -5280,7 +5332,7 @@
     </w:p>
     <w:p>
       <w:pPr>
-        <w:spacing w:before="0" w:after="60" w:line="300" w:lineRule="auto"/>
+        <w:spacing w:before="0" w:after="40" w:line="288" w:lineRule="auto"/>
       </w:pPr>
       <w:r>
         <w:rPr>
@@ -5293,7 +5345,7 @@
     </w:p>
     <w:p>
       <w:pPr>
-        <w:spacing w:before="0" w:after="60" w:line="300" w:lineRule="auto"/>
+        <w:spacing w:before="0" w:after="40" w:line="288" w:lineRule="auto"/>
       </w:pPr>
       <w:r>
         <w:rPr>
@@ -5306,7 +5358,7 @@
     </w:p>
     <w:p>
       <w:pPr>
-        <w:spacing w:before="0" w:after="60" w:line="300" w:lineRule="auto"/>
+        <w:spacing w:before="0" w:after="40" w:line="288" w:lineRule="auto"/>
       </w:pPr>
       <w:r>
         <w:rPr>
@@ -5314,12 +5366,12 @@
           <w:b w:val="0"/>
           <w:sz w:val="18"/>
         </w:rPr>
-        <w:t>[12] 最高人民法院民商事审判年度报告及公报循环贸易案例。用于支持无真实交易目的的闭环贸易应穿透识别其法律关系；不用于给合成样本作司法定性。</w:t>
+        <w:t>[12] 《最高人民法院公报》2017 年第 6 期：日照港集团岚山港务有限公司诉山西焦煤集团国际发展股份有限公司等企业借贷纠纷案〔（2015）民提字第 74 号〕，封闭式循环贸易被穿透认定为企业间借贷。用于支持无真实交易目的的闭环贸易应穿透识别其法律关系；不用于给合成样本作司法定性。</w:t>
       </w:r>
     </w:p>
     <w:p>
       <w:pPr>
-        <w:spacing w:before="160" w:after="80" w:line="336" w:lineRule="auto"/>
+        <w:spacing w:before="80" w:after="60" w:line="300" w:lineRule="auto"/>
       </w:pPr>
       <w:r>
         <w:rPr>
@@ -5332,7 +5384,7 @@
     </w:p>
     <w:p>
       <w:pPr>
-        <w:spacing w:before="0" w:after="60" w:line="336" w:lineRule="auto"/>
+        <w:spacing w:before="0" w:after="40" w:line="288" w:lineRule="auto"/>
       </w:pPr>
       <w:r>
         <w:rPr>
@@ -5361,7 +5413,7 @@
     </w:p>
     <w:p>
       <w:pPr>
-        <w:spacing w:before="0" w:after="60" w:line="336" w:lineRule="auto"/>
+        <w:spacing w:before="0" w:after="40" w:line="288" w:lineRule="auto"/>
       </w:pPr>
       <w:r>
         <w:rPr>
@@ -5390,7 +5442,7 @@
     </w:p>
     <w:p>
       <w:pPr>
-        <w:spacing w:before="0" w:after="60" w:line="336" w:lineRule="auto"/>
+        <w:spacing w:before="0" w:after="40" w:line="288" w:lineRule="auto"/>
       </w:pPr>
       <w:r>
         <w:rPr>
@@ -5419,7 +5471,7 @@
     </w:p>
     <w:p>
       <w:pPr>
-        <w:spacing w:before="0" w:after="60" w:line="336" w:lineRule="auto"/>
+        <w:spacing w:before="0" w:after="40" w:line="288" w:lineRule="auto"/>
       </w:pPr>
       <w:r>
         <w:rPr>
@@ -5432,7 +5484,7 @@
     </w:p>
     <w:p>
       <w:pPr>
-        <w:spacing w:before="0" w:after="60" w:line="336" w:lineRule="auto"/>
+        <w:spacing w:before="0" w:after="40" w:line="288" w:lineRule="auto"/>
       </w:pPr>
       <w:r>
         <w:rPr>

</xml_diff>